<commit_message>
Docs: Rule Book v2.2, Technical Manual v25, How-To v1.2 in the Library; DB Reference v3.0; CLAUDE.md
Co-Authored-By: Claude Sonnet 5.5 <noreply@anthropic.com>
</commit_message>
<xml_diff>
--- a/content/library/rule-book.docx
+++ b/content/library/rule-book.docx
@@ -29,7 +29,7 @@
           <w:bCs/>
           <w:b/>
         </w:rPr>
-        <w:t xml:space="preserve">Version 2.1 — September 21, 2026</w:t>
+        <w:t xml:space="preserve">Version 2.2 — October 5, 2026</w:t>
       </w:r>
     </w:p>
     <w:p>
@@ -2497,19 +2497,31 @@
         <w:t xml:space="preserve"> </w:t>
       </w:r>
       <w:r>
-        <w:t xml:space="preserve">amount and the reason in full; and carries notices the commissioner or</w:t>
-      </w:r>
-      <w:r>
-        <w:t xml:space="preserve"> </w:t>
-      </w:r>
-      <w:r>
-        <w:t xml:space="preserve">co-commissioner writes. A league office notice is published to the league, never</w:t>
-      </w:r>
-      <w:r>
-        <w:t xml:space="preserve"> </w:t>
-      </w:r>
-      <w:r>
-        <w:t xml:space="preserve">privately to one owner.</w:t>
+        <w:t xml:space="preserve">amount and the reason in full, together with when and why it was incurred;</w:t>
+      </w:r>
+      <w:r>
+        <w:t xml:space="preserve"> </w:t>
+      </w:r>
+      <w:r>
+        <w:t xml:space="preserve">carries notices the commissioner or co-commissioner writes; and, for a team</w:t>
+      </w:r>
+      <w:r>
+        <w:t xml:space="preserve"> </w:t>
+      </w:r>
+      <w:r>
+        <w:t xml:space="preserve">whose owner has elected it, announces that the team is out of compliance and</w:t>
+      </w:r>
+      <w:r>
+        <w:t xml:space="preserve"> </w:t>
+      </w:r>
+      <w:r>
+        <w:t xml:space="preserve">by when it must be cured. A league office notice is published to the league,</w:t>
+      </w:r>
+      <w:r>
+        <w:t xml:space="preserve"> </w:t>
+      </w:r>
+      <w:r>
+        <w:t xml:space="preserve">never privately to one owner.</w:t>
       </w:r>
     </w:p>
     <w:p>
@@ -2539,21 +2551,33 @@
         <w:t xml:space="preserve"> </w:t>
       </w:r>
       <w:r>
-        <w:t xml:space="preserve">7.9(c).</w:t>
-      </w:r>
-    </w:p>
-    <w:p>
-      <w:pPr>
-        <w:pStyle w:val="BodyText"/>
-      </w:pPr>
-      <w:r>
-        <w:t xml:space="preserve">(iv) A wire never addresses an owner personally, and nothing an owner can do</w:t>
-      </w:r>
-      <w:r>
-        <w:t xml:space="preserve"> </w:t>
-      </w:r>
-      <w:r>
-        <w:t xml:space="preserve">makes a wire speak.</w:t>
+        <w:t xml:space="preserve">7.9(c), and announces every poach window when it opens, naming the player and</w:t>
+      </w:r>
+      <w:r>
+        <w:t xml:space="preserve"> </w:t>
+      </w:r>
+      <w:r>
+        <w:t xml:space="preserve">the team holding him but never the team that opened the window.</w:t>
+      </w:r>
+    </w:p>
+    <w:p>
+      <w:pPr>
+        <w:pStyle w:val="BodyText"/>
+      </w:pPr>
+      <w:r>
+        <w:t xml:space="preserve">(iv) A wire never addresses an owner personally. Apart from an owner’s own</w:t>
+      </w:r>
+      <w:r>
+        <w:t xml:space="preserve"> </w:t>
+      </w:r>
+      <w:r>
+        <w:t xml:space="preserve">submission to the rumour desk, his own election under (ii) and the opening of a</w:t>
+      </w:r>
+      <w:r>
+        <w:t xml:space="preserve"> </w:t>
+      </w:r>
+      <w:r>
+        <w:t xml:space="preserve">poach window, nothing an owner can do makes a wire speak.</w:t>
       </w:r>
     </w:p>
     <w:bookmarkEnd w:id="35"/>
@@ -4930,19 +4954,41 @@
         <w:t xml:space="preserve">flagged, not refused</w:t>
       </w:r>
       <w:r>
-        <w:t xml:space="preserve">. The placement stands; the roster is out</w:t>
-      </w:r>
-      <w:r>
-        <w:t xml:space="preserve"> </w:t>
-      </w:r>
-      <w:r>
-        <w:t xml:space="preserve">of compliance under 3.6(c); and the owner cures it by the weekly compliance</w:t>
-      </w:r>
-      <w:r>
-        <w:t xml:space="preserve"> </w:t>
-      </w:r>
-      <w:r>
-        <w:t xml:space="preserve">instant like any other overage.</w:t>
+        <w:t xml:space="preserve">. The placement stands and the roster is</w:t>
+      </w:r>
+      <w:r>
+        <w:t xml:space="preserve"> </w:t>
+      </w:r>
+      <w:r>
+        <w:t xml:space="preserve">out of compliance under 3.6(c). The same holds for a player already on injured</w:t>
+      </w:r>
+      <w:r>
+        <w:t xml:space="preserve"> </w:t>
+      </w:r>
+      <w:r>
+        <w:t xml:space="preserve">reserve whose designation lapses. A player who holds an injured reserve place</w:t>
+      </w:r>
+      <w:r>
+        <w:t xml:space="preserve"> </w:t>
+      </w:r>
+      <w:r>
+        <w:t xml:space="preserve">without a qualifying designation for</w:t>
+      </w:r>
+      <w:r>
+        <w:t xml:space="preserve"> </w:t>
+      </w:r>
+      <w:r>
+        <w:rPr>
+          <w:bCs/>
+          <w:b/>
+        </w:rPr>
+        <w:t xml:space="preserve">24 hours</w:t>
+      </w:r>
+      <w:r>
+        <w:t xml:space="preserve"> </w:t>
+      </w:r>
+      <w:r>
+        <w:t xml:space="preserve">draws the fine in 6.7(h).</w:t>
       </w:r>
     </w:p>
     <w:p>
@@ -4978,6 +5024,126 @@
       </w:r>
       <w:r>
         <w:t xml:space="preserve">reserve.</w:t>
+      </w:r>
+    </w:p>
+    <w:p>
+      <w:pPr>
+        <w:pStyle w:val="BodyText"/>
+      </w:pPr>
+      <w:r>
+        <w:t xml:space="preserve">(d)</w:t>
+      </w:r>
+      <w:r>
+        <w:t xml:space="preserve"> </w:t>
+      </w:r>
+      <w:r>
+        <w:rPr>
+          <w:bCs/>
+          <w:b/>
+        </w:rPr>
+        <w:t xml:space="preserve">Standing instructions.</w:t>
+      </w:r>
+      <w:r>
+        <w:t xml:space="preserve"> </w:t>
+      </w:r>
+      <w:r>
+        <w:t xml:space="preserve">An owner may lodge either or both of the</w:t>
+      </w:r>
+      <w:r>
+        <w:t xml:space="preserve"> </w:t>
+      </w:r>
+      <w:r>
+        <w:t xml:space="preserve">following standing instructions, and may withdraw either at any time. Neither</w:t>
+      </w:r>
+      <w:r>
+        <w:t xml:space="preserve"> </w:t>
+      </w:r>
+      <w:r>
+        <w:t xml:space="preserve">applies to a team whose owner has not lodged it.</w:t>
+      </w:r>
+    </w:p>
+    <w:p>
+      <w:pPr>
+        <w:pStyle w:val="BodyText"/>
+      </w:pPr>
+      <w:r>
+        <w:t xml:space="preserve">(i)</w:t>
+      </w:r>
+      <w:r>
+        <w:t xml:space="preserve"> </w:t>
+      </w:r>
+      <w:r>
+        <w:rPr>
+          <w:bCs/>
+          <w:b/>
+        </w:rPr>
+        <w:t xml:space="preserve">Back to the Active Roster.</w:t>
+      </w:r>
+      <w:r>
+        <w:t xml:space="preserve"> </w:t>
+      </w:r>
+      <w:r>
+        <w:t xml:space="preserve">A player on the owner’s injured reserve whose</w:t>
+      </w:r>
+      <w:r>
+        <w:t xml:space="preserve"> </w:t>
+      </w:r>
+      <w:r>
+        <w:t xml:space="preserve">designation no longer qualifies under (b) is moved to the Active Roster, even</w:t>
+      </w:r>
+      <w:r>
+        <w:t xml:space="preserve"> </w:t>
+      </w:r>
+      <w:r>
+        <w:t xml:space="preserve">where the move takes the roster past a limit in 3.6(c). The 24-hour period in</w:t>
+      </w:r>
+      <w:r>
+        <w:t xml:space="preserve"> </w:t>
+      </w:r>
+      <w:r>
+        <w:t xml:space="preserve">(b)(i) ends with the move, and any limit the move breaks is a violation in its</w:t>
+      </w:r>
+      <w:r>
+        <w:t xml:space="preserve"> </w:t>
+      </w:r>
+      <w:r>
+        <w:t xml:space="preserve">own right under 6.7.</w:t>
+      </w:r>
+    </w:p>
+    <w:p>
+      <w:pPr>
+        <w:pStyle w:val="BodyText"/>
+      </w:pPr>
+      <w:r>
+        <w:t xml:space="preserve">(ii)</w:t>
+      </w:r>
+      <w:r>
+        <w:t xml:space="preserve"> </w:t>
+      </w:r>
+      <w:r>
+        <w:rPr>
+          <w:bCs/>
+          <w:b/>
+        </w:rPr>
+        <w:t xml:space="preserve">To injured reserve.</w:t>
+      </w:r>
+      <w:r>
+        <w:t xml:space="preserve"> </w:t>
+      </w:r>
+      <w:r>
+        <w:t xml:space="preserve">A player on the owner’s Active Roster who carries a</w:t>
+      </w:r>
+      <w:r>
+        <w:t xml:space="preserve"> </w:t>
+      </w:r>
+      <w:r>
+        <w:t xml:space="preserve">qualifying designation is moved to injured reserve, provided an injured reserve</w:t>
+      </w:r>
+      <w:r>
+        <w:t xml:space="preserve"> </w:t>
+      </w:r>
+      <w:r>
+        <w:t xml:space="preserve">place is open. A practice squad player is never moved under this paragraph.</w:t>
       </w:r>
     </w:p>
     <w:bookmarkEnd w:id="47"/>
@@ -5137,105 +5303,75 @@
         <w:t xml:space="preserve"> </w:t>
       </w:r>
       <w:r>
-        <w:t xml:space="preserve">draws the fine in 6.7.</w:t>
-      </w:r>
-    </w:p>
-    <w:p>
-      <w:pPr>
-        <w:pStyle w:val="BodyText"/>
-      </w:pPr>
-      <w:r>
-        <w:t xml:space="preserve">(i) The commissioner or co-commissioner brings a non-compliant roster into</w:t>
-      </w:r>
-      <w:r>
-        <w:t xml:space="preserve"> </w:t>
-      </w:r>
-      <w:r>
-        <w:t xml:space="preserve">compliance by</w:t>
-      </w:r>
-      <w:r>
-        <w:t xml:space="preserve"> </w:t>
-      </w:r>
-      <w:r>
-        <w:rPr>
-          <w:bCs/>
-          <w:b/>
-        </w:rPr>
-        <w:t xml:space="preserve">20:00</w:t>
-      </w:r>
-      <w:r>
-        <w:t xml:space="preserve"> </w:t>
-      </w:r>
-      <w:r>
-        <w:t xml:space="preserve">the same day, working with the owner where possible and</w:t>
-      </w:r>
-      <w:r>
-        <w:t xml:space="preserve"> </w:t>
-      </w:r>
-      <w:r>
-        <w:t xml:space="preserve">otherwise releasing players</w:t>
-      </w:r>
-      <w:r>
-        <w:t xml:space="preserve"> </w:t>
-      </w:r>
-      <w:r>
-        <w:rPr>
-          <w:bCs/>
-          <w:b/>
-        </w:rPr>
-        <w:t xml:space="preserve">last added, first released</w:t>
-      </w:r>
-      <w:r>
-        <w:t xml:space="preserve">. A release made this</w:t>
-      </w:r>
-      <w:r>
-        <w:t xml:space="preserve"> </w:t>
-      </w:r>
-      <w:r>
-        <w:t xml:space="preserve">way goes straight to free agency and does not pass through the waiver wire.</w:t>
-      </w:r>
-    </w:p>
-    <w:p>
-      <w:pPr>
-        <w:pStyle w:val="BodyText"/>
-      </w:pPr>
-      <w:r>
-        <w:t xml:space="preserve">(ii) A player returning from injured reserve or from suspension gives his owner</w:t>
-      </w:r>
-      <w:r>
-        <w:t xml:space="preserve"> </w:t>
-      </w:r>
-      <w:r>
-        <w:rPr>
-          <w:bCs/>
-          <w:b/>
-        </w:rPr>
-        <w:t xml:space="preserve">24 hours</w:t>
-      </w:r>
-      <w:r>
-        <w:t xml:space="preserve"> </w:t>
-      </w:r>
-      <w:r>
-        <w:t xml:space="preserve">to reach compliance, after which the fine is</w:t>
-      </w:r>
-      <w:r>
-        <w:t xml:space="preserve"> </w:t>
-      </w:r>
-      <w:r>
-        <w:rPr>
-          <w:bCs/>
-          <w:b/>
-        </w:rPr>
-        <w:t xml:space="preserve">$50</w:t>
-      </w:r>
-      <w:r>
-        <w:t xml:space="preserve">. A returning</w:t>
-      </w:r>
-      <w:r>
-        <w:t xml:space="preserve"> </w:t>
-      </w:r>
-      <w:r>
-        <w:t xml:space="preserve">player is not eligible to score until the roster is compliant.</w:t>
+        <w:t xml:space="preserve">draws the fines in 6.7. The owner cures a non-compliant roster himself; the fines</w:t>
+      </w:r>
+      <w:r>
+        <w:t xml:space="preserve"> </w:t>
+      </w:r>
+      <w:r>
+        <w:t xml:space="preserve">in 6.7, and the scoring rule in 6.7(i), apply until he does.</w:t>
+      </w:r>
+    </w:p>
+    <w:p>
+      <w:pPr>
+        <w:pStyle w:val="BodyText"/>
+      </w:pPr>
+      <w:r>
+        <w:t xml:space="preserve">(i)</w:t>
+      </w:r>
+      <w:r>
+        <w:t xml:space="preserve"> </w:t>
+      </w:r>
+      <w:r>
+        <w:rPr>
+          <w:iCs/>
+          <w:i/>
+        </w:rPr>
+        <w:t xml:space="preserve">Repealed October 4, 2026.</w:t>
+      </w:r>
+      <w:r>
+        <w:t xml:space="preserve"> </w:t>
+      </w:r>
+      <w:r>
+        <w:t xml:space="preserve">This paragraph required the commissioner or</w:t>
+      </w:r>
+      <w:r>
+        <w:t xml:space="preserve"> </w:t>
+      </w:r>
+      <w:r>
+        <w:t xml:space="preserve">co-commissioner to bring a non-compliant roster into compliance by 20:00 the</w:t>
+      </w:r>
+      <w:r>
+        <w:t xml:space="preserve"> </w:t>
+      </w:r>
+      <w:r>
+        <w:t xml:space="preserve">same day, releasing players last added, first released. The letter is held open</w:t>
+      </w:r>
+      <w:r>
+        <w:t xml:space="preserve"> </w:t>
+      </w:r>
+      <w:r>
+        <w:t xml:space="preserve">so that citations to it resolve.</w:t>
+      </w:r>
+    </w:p>
+    <w:p>
+      <w:pPr>
+        <w:pStyle w:val="BodyText"/>
+      </w:pPr>
+      <w:r>
+        <w:t xml:space="preserve">(ii) A player returning from injured reserve or from suspension is governed by</w:t>
+      </w:r>
+      <w:r>
+        <w:t xml:space="preserve"> </w:t>
+      </w:r>
+      <w:r>
+        <w:t xml:space="preserve">3.4(b)(i) while he remains on injured reserve, and by 6.7(i) once his return</w:t>
+      </w:r>
+      <w:r>
+        <w:t xml:space="preserve"> </w:t>
+      </w:r>
+      <w:r>
+        <w:t xml:space="preserve">takes the Active Roster past a limit.</w:t>
       </w:r>
     </w:p>
     <w:p>
@@ -10833,58 +10969,77 @@
         <w:t xml:space="preserve"> </w:t>
       </w:r>
       <w:r>
-        <w:t xml:space="preserve">Nothing resolves unattended. The commissioner or</w:t>
-      </w:r>
-      <w:r>
-        <w:t xml:space="preserve"> </w:t>
-      </w:r>
-      <w:r>
-        <w:t xml:space="preserve">co-commissioner resolves a window after it closes, however late, and the signing</w:t>
-      </w:r>
-      <w:r>
-        <w:t xml:space="preserve"> </w:t>
-      </w:r>
-      <w:r>
-        <w:t xml:space="preserve">week is the week of resolution.</w:t>
-      </w:r>
-      <w:r>
-        <w:t xml:space="preserve"> </w:t>
-      </w:r>
-      <w:r>
-        <w:rPr>
-          <w:bCs/>
-          <w:b/>
-        </w:rPr>
-        <w:t xml:space="preserve">Owner Cash and the Salary Ceiling are hard</w:t>
-      </w:r>
-      <w:r>
-        <w:rPr>
-          <w:bCs/>
-          <w:b/>
-        </w:rPr>
-        <w:t xml:space="preserve"> </w:t>
-      </w:r>
-      <w:r>
-        <w:rPr>
-          <w:bCs/>
-          <w:b/>
-        </w:rPr>
-        <w:t xml:space="preserve">gates</w:t>
-      </w:r>
-      <w:r>
-        <w:t xml:space="preserve">: a winning offer the team cannot pay from that season’s Owner Cash, or</w:t>
-      </w:r>
-      <w:r>
-        <w:t xml:space="preserve"> </w:t>
-      </w:r>
-      <w:r>
-        <w:t xml:space="preserve">that would take it past its Salary Ceiling, is passed over and the next-highest</w:t>
-      </w:r>
-      <w:r>
-        <w:t xml:space="preserve"> </w:t>
-      </w:r>
-      <w:r>
-        <w:t xml:space="preserve">offer wins at its own terms. The roster maximums are</w:t>
+        <w:t xml:space="preserve">A window is settled when it closes. Where</w:t>
+      </w:r>
+      <w:r>
+        <w:t xml:space="preserve"> </w:t>
+      </w:r>
+      <w:r>
+        <w:t xml:space="preserve">settlement is completed later, by an officer or otherwise, the window is still</w:t>
+      </w:r>
+      <w:r>
+        <w:t xml:space="preserve"> </w:t>
+      </w:r>
+      <w:r>
+        <w:t xml:space="preserve">settled as at its close:</w:t>
+      </w:r>
+      <w:r>
+        <w:t xml:space="preserve"> </w:t>
+      </w:r>
+      <w:r>
+        <w:rPr>
+          <w:bCs/>
+          <w:b/>
+        </w:rPr>
+        <w:t xml:space="preserve">the signing week is the week in which the window</w:t>
+      </w:r>
+      <w:r>
+        <w:rPr>
+          <w:bCs/>
+          <w:b/>
+        </w:rPr>
+        <w:t xml:space="preserve"> </w:t>
+      </w:r>
+      <w:r>
+        <w:rPr>
+          <w:bCs/>
+          <w:b/>
+        </w:rPr>
+        <w:t xml:space="preserve">closed</w:t>
+      </w:r>
+      <w:r>
+        <w:t xml:space="preserve">.</w:t>
+      </w:r>
+      <w:r>
+        <w:t xml:space="preserve"> </w:t>
+      </w:r>
+      <w:r>
+        <w:rPr>
+          <w:bCs/>
+          <w:b/>
+        </w:rPr>
+        <w:t xml:space="preserve">Owner Cash and the Salary Ceiling are hard gates</w:t>
+      </w:r>
+      <w:r>
+        <w:t xml:space="preserve">: a winning offer</w:t>
+      </w:r>
+      <w:r>
+        <w:t xml:space="preserve"> </w:t>
+      </w:r>
+      <w:r>
+        <w:t xml:space="preserve">the team cannot pay from that season’s Owner Cash, or that would take it past</w:t>
+      </w:r>
+      <w:r>
+        <w:t xml:space="preserve"> </w:t>
+      </w:r>
+      <w:r>
+        <w:t xml:space="preserve">its Salary Ceiling, is passed over and the next-highest offer wins at its own</w:t>
+      </w:r>
+      <w:r>
+        <w:t xml:space="preserve"> </w:t>
+      </w:r>
+      <w:r>
+        <w:t xml:space="preserve">terms. The roster maximums are</w:t>
       </w:r>
       <w:r>
         <w:t xml:space="preserve"> </w:t>
@@ -11832,19 +11987,19 @@
         <w:t xml:space="preserve"> </w:t>
       </w:r>
       <w:r>
-        <w:t xml:space="preserve">on a poach. The window is resolved by the commissioner or co-commissioner after</w:t>
-      </w:r>
-      <w:r>
-        <w:t xml:space="preserve"> </w:t>
-      </w:r>
-      <w:r>
-        <w:t xml:space="preserve">it closes, however late, and the new contract’s signing week is the week of</w:t>
-      </w:r>
-      <w:r>
-        <w:t xml:space="preserve"> </w:t>
-      </w:r>
-      <w:r>
-        <w:t xml:space="preserve">resolution.</w:t>
+        <w:t xml:space="preserve">on a poach. The window is settled when it closes, under 5.14(h): the new</w:t>
+      </w:r>
+      <w:r>
+        <w:t xml:space="preserve"> </w:t>
+      </w:r>
+      <w:r>
+        <w:t xml:space="preserve">contract’s signing week, and the settlement of the contract being replaced, are</w:t>
+      </w:r>
+      <w:r>
+        <w:t xml:space="preserve"> </w:t>
+      </w:r>
+      <w:r>
+        <w:t xml:space="preserve">those of the week in which the window closed.</w:t>
       </w:r>
     </w:p>
     <w:p>
@@ -15646,91 +15801,107 @@
         <w:pStyle w:val="FirstParagraph"/>
       </w:pPr>
       <w:r>
-        <w:t xml:space="preserve">(a) A roster out of compliance at the weekly compliance instant draws a fine of</w:t>
-      </w:r>
-      <w:r>
-        <w:t xml:space="preserve"> </w:t>
-      </w:r>
-      <w:r>
-        <w:rPr>
-          <w:bCs/>
-          <w:b/>
-        </w:rPr>
-        <w:t xml:space="preserve">$150 per violation</w:t>
-      </w:r>
-      <w:r>
-        <w:t xml:space="preserve"> </w:t>
-      </w:r>
-      <w:r>
-        <w:t xml:space="preserve">in Owner Cash. Roster size and cap are separate</w:t>
-      </w:r>
-      <w:r>
-        <w:t xml:space="preserve"> </w:t>
-      </w:r>
-      <w:r>
-        <w:t xml:space="preserve">violations, and so is a player holding an injured reserve place without a</w:t>
-      </w:r>
-      <w:r>
-        <w:t xml:space="preserve"> </w:t>
-      </w:r>
-      <w:r>
-        <w:t xml:space="preserve">qualifying designation.</w:t>
-      </w:r>
-    </w:p>
-    <w:p>
-      <w:pPr>
-        <w:pStyle w:val="BodyText"/>
-      </w:pPr>
-      <w:r>
-        <w:t xml:space="preserve">(b) An owner who brings his</w:t>
-      </w:r>
-      <w:r>
-        <w:t xml:space="preserve"> </w:t>
-      </w:r>
-      <w:r>
-        <w:rPr>
-          <w:bCs/>
-          <w:b/>
-        </w:rPr>
-        <w:t xml:space="preserve">own</w:t>
-      </w:r>
-      <w:r>
-        <w:t xml:space="preserve"> </w:t>
-      </w:r>
-      <w:r>
-        <w:t xml:space="preserve">roster into compliance before</w:t>
-      </w:r>
-      <w:r>
-        <w:t xml:space="preserve"> </w:t>
-      </w:r>
-      <w:r>
-        <w:rPr>
-          <w:bCs/>
-          <w:b/>
-        </w:rPr>
-        <w:t xml:space="preserve">20:00</w:t>
-      </w:r>
-      <w:r>
-        <w:t xml:space="preserve"> </w:t>
-      </w:r>
-      <w:r>
-        <w:t xml:space="preserve">the</w:t>
-      </w:r>
-      <w:r>
-        <w:t xml:space="preserve"> </w:t>
-      </w:r>
-      <w:r>
-        <w:t xml:space="preserve">same day pays</w:t>
-      </w:r>
-      <w:r>
-        <w:t xml:space="preserve"> </w:t>
-      </w:r>
-      <w:r>
-        <w:rPr>
-          <w:bCs/>
-          <w:b/>
-        </w:rPr>
-        <w:t xml:space="preserve">$50</w:t>
+        <w:t xml:space="preserve">(a)</w:t>
+      </w:r>
+      <w:r>
+        <w:t xml:space="preserve"> </w:t>
+      </w:r>
+      <w:r>
+        <w:rPr>
+          <w:bCs/>
+          <w:b/>
+        </w:rPr>
+        <w:t xml:space="preserve">The roster fine.</w:t>
+      </w:r>
+      <w:r>
+        <w:t xml:space="preserve"> </w:t>
+      </w:r>
+      <w:r>
+        <w:t xml:space="preserve">A roster out of compliance at the weekly compliance</w:t>
+      </w:r>
+      <w:r>
+        <w:t xml:space="preserve"> </w:t>
+      </w:r>
+      <w:r>
+        <w:t xml:space="preserve">instant draws</w:t>
+      </w:r>
+      <w:r>
+        <w:t xml:space="preserve"> </w:t>
+      </w:r>
+      <w:r>
+        <w:rPr>
+          <w:bCs/>
+          <w:b/>
+        </w:rPr>
+        <w:t xml:space="preserve">one roster fine</w:t>
+      </w:r>
+      <w:r>
+        <w:t xml:space="preserve"> </w:t>
+      </w:r>
+      <w:r>
+        <w:t xml:space="preserve">for that week, whatever the number of</w:t>
+      </w:r>
+      <w:r>
+        <w:t xml:space="preserve"> </w:t>
+      </w:r>
+      <w:r>
+        <w:t xml:space="preserve">violations:</w:t>
+      </w:r>
+      <w:r>
+        <w:t xml:space="preserve"> </w:t>
+      </w:r>
+      <w:r>
+        <w:rPr>
+          <w:bCs/>
+          <w:b/>
+        </w:rPr>
+        <w:t xml:space="preserve">$75</w:t>
+      </w:r>
+      <w:r>
+        <w:t xml:space="preserve"> </w:t>
+      </w:r>
+      <w:r>
+        <w:t xml:space="preserve">in Owner Cash.</w:t>
+      </w:r>
+    </w:p>
+    <w:p>
+      <w:pPr>
+        <w:pStyle w:val="BodyText"/>
+      </w:pPr>
+      <w:r>
+        <w:t xml:space="preserve">(b)</w:t>
+      </w:r>
+      <w:r>
+        <w:t xml:space="preserve"> </w:t>
+      </w:r>
+      <w:r>
+        <w:rPr>
+          <w:bCs/>
+          <w:b/>
+        </w:rPr>
+        <w:t xml:space="preserve">Cured before the first game.</w:t>
+      </w:r>
+      <w:r>
+        <w:t xml:space="preserve"> </w:t>
+      </w:r>
+      <w:r>
+        <w:t xml:space="preserve">Where the roster is fully compliant before</w:t>
+      </w:r>
+      <w:r>
+        <w:t xml:space="preserve"> </w:t>
+      </w:r>
+      <w:r>
+        <w:t xml:space="preserve">the first game of that league week kicks off, the roster fine is</w:t>
+      </w:r>
+      <w:r>
+        <w:t xml:space="preserve"> </w:t>
+      </w:r>
+      <w:r>
+        <w:rPr>
+          <w:bCs/>
+          <w:b/>
+        </w:rPr>
+        <w:t xml:space="preserve">$25</w:t>
       </w:r>
       <w:r>
         <w:t xml:space="preserve"> </w:t>
@@ -15744,7 +15915,23 @@
         <w:pStyle w:val="BodyText"/>
       </w:pPr>
       <w:r>
-        <w:t xml:space="preserve">(c) From a team’s</w:t>
+        <w:t xml:space="preserve">(c)</w:t>
+      </w:r>
+      <w:r>
+        <w:t xml:space="preserve"> </w:t>
+      </w:r>
+      <w:r>
+        <w:rPr>
+          <w:bCs/>
+          <w:b/>
+        </w:rPr>
+        <w:t xml:space="preserve">Escalation.</w:t>
+      </w:r>
+      <w:r>
+        <w:t xml:space="preserve"> </w:t>
+      </w:r>
+      <w:r>
+        <w:t xml:space="preserve">From a team’s</w:t>
       </w:r>
       <w:r>
         <w:t xml:space="preserve"> </w:t>
@@ -15760,29 +15947,38 @@
         <w:t xml:space="preserve"> </w:t>
       </w:r>
       <w:r>
-        <w:t xml:space="preserve">violation in a season the fine rises by</w:t>
-      </w:r>
-      <w:r>
-        <w:t xml:space="preserve"> </w:t>
-      </w:r>
-      <w:r>
-        <w:rPr>
-          <w:bCs/>
-          <w:b/>
-        </w:rPr>
-        <w:t xml:space="preserve">$50</w:t>
-      </w:r>
-      <w:r>
-        <w:t xml:space="preserve"> </w:t>
-      </w:r>
-      <w:r>
-        <w:t xml:space="preserve">each</w:t>
-      </w:r>
-      <w:r>
-        <w:t xml:space="preserve"> </w:t>
-      </w:r>
-      <w:r>
-        <w:t xml:space="preserve">time — $200, $250, and so on.</w:t>
+        <w:t xml:space="preserve">roster fine of the season, each</w:t>
+      </w:r>
+      <w:r>
+        <w:t xml:space="preserve"> </w:t>
+      </w:r>
+      <w:r>
+        <w:t xml:space="preserve">roster fine rises by</w:t>
+      </w:r>
+      <w:r>
+        <w:t xml:space="preserve"> </w:t>
+      </w:r>
+      <w:r>
+        <w:rPr>
+          <w:bCs/>
+          <w:b/>
+        </w:rPr>
+        <w:t xml:space="preserve">$25</w:t>
+      </w:r>
+      <w:r>
+        <w:t xml:space="preserve">, and both figures in (a) and (b) rise together:</w:t>
+      </w:r>
+      <w:r>
+        <w:t xml:space="preserve"> </w:t>
+      </w:r>
+      <w:r>
+        <w:t xml:space="preserve">the fourth is $100, or $50 if cured; the fifth is $125, or $75 if cured;</w:t>
+      </w:r>
+      <w:r>
+        <w:t xml:space="preserve"> </w:t>
+      </w:r>
+      <w:r>
+        <w:t xml:space="preserve">and so on.</w:t>
       </w:r>
     </w:p>
     <w:p>
@@ -15897,6 +16093,343 @@
       </w:r>
       <w:r>
         <w:t xml:space="preserve">season.</w:t>
+      </w:r>
+    </w:p>
+    <w:p>
+      <w:pPr>
+        <w:pStyle w:val="BodyText"/>
+      </w:pPr>
+      <w:r>
+        <w:t xml:space="preserve">(g)</w:t>
+      </w:r>
+      <w:r>
+        <w:t xml:space="preserve"> </w:t>
+      </w:r>
+      <w:r>
+        <w:rPr>
+          <w:bCs/>
+          <w:b/>
+        </w:rPr>
+        <w:t xml:space="preserve">Violations still open after the first game.</w:t>
+      </w:r>
+      <w:r>
+        <w:t xml:space="preserve"> </w:t>
+      </w:r>
+      <w:r>
+        <w:t xml:space="preserve">Each violation present at the</w:t>
+      </w:r>
+      <w:r>
+        <w:t xml:space="preserve"> </w:t>
+      </w:r>
+      <w:r>
+        <w:t xml:space="preserve">compliance instant that is still present</w:t>
+      </w:r>
+      <w:r>
+        <w:t xml:space="preserve"> </w:t>
+      </w:r>
+      <w:r>
+        <w:rPr>
+          <w:bCs/>
+          <w:b/>
+        </w:rPr>
+        <w:t xml:space="preserve">24 hours after the first game of that</w:t>
+      </w:r>
+      <w:r>
+        <w:rPr>
+          <w:bCs/>
+          <w:b/>
+        </w:rPr>
+        <w:t xml:space="preserve"> </w:t>
+      </w:r>
+      <w:r>
+        <w:rPr>
+          <w:bCs/>
+          <w:b/>
+        </w:rPr>
+        <w:t xml:space="preserve">league week kicks off</w:t>
+      </w:r>
+      <w:r>
+        <w:t xml:space="preserve"> </w:t>
+      </w:r>
+      <w:r>
+        <w:t xml:space="preserve">draws a further</w:t>
+      </w:r>
+      <w:r>
+        <w:t xml:space="preserve"> </w:t>
+      </w:r>
+      <w:r>
+        <w:rPr>
+          <w:bCs/>
+          <w:b/>
+        </w:rPr>
+        <w:t xml:space="preserve">$25 per unit</w:t>
+      </w:r>
+      <w:r>
+        <w:t xml:space="preserve">, on top of the roster</w:t>
+      </w:r>
+      <w:r>
+        <w:t xml:space="preserve"> </w:t>
+      </w:r>
+      <w:r>
+        <w:t xml:space="preserve">fine. A unit is one player over a limit — the practice squad limits included —</w:t>
+      </w:r>
+      <w:r>
+        <w:t xml:space="preserve"> </w:t>
+      </w:r>
+      <w:r>
+        <w:t xml:space="preserve">or one other violation, and a violation is counted at no more units than it had</w:t>
+      </w:r>
+      <w:r>
+        <w:t xml:space="preserve"> </w:t>
+      </w:r>
+      <w:r>
+        <w:t xml:space="preserve">at the compliance instant. An injured reserve place held without a qualifying</w:t>
+      </w:r>
+      <w:r>
+        <w:t xml:space="preserve"> </w:t>
+      </w:r>
+      <w:r>
+        <w:t xml:space="preserve">designation is priced under (h) instead.</w:t>
+      </w:r>
+    </w:p>
+    <w:p>
+      <w:pPr>
+        <w:pStyle w:val="BodyText"/>
+      </w:pPr>
+      <w:r>
+        <w:t xml:space="preserve">(h)</w:t>
+      </w:r>
+      <w:r>
+        <w:t xml:space="preserve"> </w:t>
+      </w:r>
+      <w:r>
+        <w:rPr>
+          <w:bCs/>
+          <w:b/>
+        </w:rPr>
+        <w:t xml:space="preserve">Injured reserve without a designation.</w:t>
+      </w:r>
+      <w:r>
+        <w:t xml:space="preserve"> </w:t>
+      </w:r>
+      <w:r>
+        <w:t xml:space="preserve">A player who holds an injured</w:t>
+      </w:r>
+      <w:r>
+        <w:t xml:space="preserve"> </w:t>
+      </w:r>
+      <w:r>
+        <w:t xml:space="preserve">reserve place without a qualifying designation under 3.4(b) for</w:t>
+      </w:r>
+      <w:r>
+        <w:t xml:space="preserve"> </w:t>
+      </w:r>
+      <w:r>
+        <w:rPr>
+          <w:bCs/>
+          <w:b/>
+        </w:rPr>
+        <w:t xml:space="preserve">24 hours</w:t>
+      </w:r>
+      <w:r>
+        <w:t xml:space="preserve">,</w:t>
+      </w:r>
+      <w:r>
+        <w:t xml:space="preserve"> </w:t>
+      </w:r>
+      <w:r>
+        <w:t xml:space="preserve">counted from the placement or from the lapse of his designation, draws</w:t>
+      </w:r>
+      <w:r>
+        <w:t xml:space="preserve"> </w:t>
+      </w:r>
+      <w:r>
+        <w:rPr>
+          <w:bCs/>
+          <w:b/>
+        </w:rPr>
+        <w:t xml:space="preserve">$25</w:t>
+      </w:r>
+      <w:r>
+        <w:t xml:space="preserve">.</w:t>
+      </w:r>
+      <w:r>
+        <w:t xml:space="preserve"> </w:t>
+      </w:r>
+      <w:r>
+        <w:t xml:space="preserve">It is charged once for each lapse.</w:t>
+      </w:r>
+    </w:p>
+    <w:p>
+      <w:pPr>
+        <w:pStyle w:val="BodyText"/>
+      </w:pPr>
+      <w:r>
+        <w:t xml:space="preserve">(i)</w:t>
+      </w:r>
+      <w:r>
+        <w:t xml:space="preserve"> </w:t>
+      </w:r>
+      <w:r>
+        <w:rPr>
+          <w:bCs/>
+          <w:b/>
+        </w:rPr>
+        <w:t xml:space="preserve">Over an Active Roster limit after the compliance instant.</w:t>
+      </w:r>
+      <w:r>
+        <w:t xml:space="preserve"> </w:t>
+      </w:r>
+      <w:r>
+        <w:t xml:space="preserve">Where, after</w:t>
+      </w:r>
+      <w:r>
+        <w:t xml:space="preserve"> </w:t>
+      </w:r>
+      <w:r>
+        <w:t xml:space="preserve">the compliance instant, a team is over the Active Roster maximum of 25, or over</w:t>
+      </w:r>
+      <w:r>
+        <w:t xml:space="preserve"> </w:t>
+      </w:r>
+      <w:r>
+        <w:t xml:space="preserve">three quarterbacks or three kickers:</w:t>
+      </w:r>
+    </w:p>
+    <w:p>
+      <w:pPr>
+        <w:pStyle w:val="BodyText"/>
+      </w:pPr>
+      <w:r>
+        <w:t xml:space="preserve">    (A) the players over the limit are the ones</w:t>
+      </w:r>
+      <w:r>
+        <w:t xml:space="preserve"> </w:t>
+      </w:r>
+      <w:r>
+        <w:rPr>
+          <w:bCs/>
+          <w:b/>
+        </w:rPr>
+        <w:t xml:space="preserve">most recently</w:t>
+      </w:r>
+      <w:r>
+        <w:rPr>
+          <w:bCs/>
+          <w:b/>
+        </w:rPr>
+        <w:t xml:space="preserve"> </w:t>
+      </w:r>
+      <w:r>
+        <w:rPr>
+          <w:bCs/>
+          <w:b/>
+        </w:rPr>
+        <w:t xml:space="preserve">added</w:t>
+      </w:r>
+      <w:r>
+        <w:t xml:space="preserve"> </w:t>
+      </w:r>
+      <w:r>
+        <w:t xml:space="preserve">to the Active Roster;</w:t>
+      </w:r>
+    </w:p>
+    <w:p>
+      <w:pPr>
+        <w:pStyle w:val="BodyText"/>
+      </w:pPr>
+      <w:r>
+        <w:t xml:space="preserve">    (B) each of them whose NFL game kicks off while the team is</w:t>
+      </w:r>
+      <w:r>
+        <w:t xml:space="preserve"> </w:t>
+      </w:r>
+      <w:r>
+        <w:t xml:space="preserve">still over the limit</w:t>
+      </w:r>
+      <w:r>
+        <w:t xml:space="preserve"> </w:t>
+      </w:r>
+      <w:r>
+        <w:rPr>
+          <w:bCs/>
+          <w:b/>
+        </w:rPr>
+        <w:t xml:space="preserve">scores zero</w:t>
+      </w:r>
+      <w:r>
+        <w:t xml:space="preserve"> </w:t>
+      </w:r>
+      <w:r>
+        <w:t xml:space="preserve">for that league week; and</w:t>
+      </w:r>
+    </w:p>
+    <w:p>
+      <w:pPr>
+        <w:pStyle w:val="BodyText"/>
+      </w:pPr>
+      <w:r>
+        <w:t xml:space="preserve">    (C) each of them beyond the number the team was over by at</w:t>
+      </w:r>
+      <w:r>
+        <w:t xml:space="preserve"> </w:t>
+      </w:r>
+      <w:r>
+        <w:t xml:space="preserve">the compliance instant also draws</w:t>
+      </w:r>
+      <w:r>
+        <w:t xml:space="preserve"> </w:t>
+      </w:r>
+      <w:r>
+        <w:rPr>
+          <w:bCs/>
+          <w:b/>
+        </w:rPr>
+        <w:t xml:space="preserve">$25</w:t>
+      </w:r>
+      <w:r>
+        <w:t xml:space="preserve"> </w:t>
+      </w:r>
+      <w:r>
+        <w:t xml:space="preserve">at his kickoff. An overage already</w:t>
+      </w:r>
+      <w:r>
+        <w:t xml:space="preserve"> </w:t>
+      </w:r>
+      <w:r>
+        <w:t xml:space="preserve">present at the compliance instant is priced by (a) to (c) and (g).</w:t>
+      </w:r>
+    </w:p>
+    <w:p>
+      <w:pPr>
+        <w:pStyle w:val="BodyText"/>
+      </w:pPr>
+      <w:r>
+        <w:t xml:space="preserve">A player over more than one limit at once is fined once.</w:t>
+      </w:r>
+    </w:p>
+    <w:p>
+      <w:pPr>
+        <w:pStyle w:val="BodyText"/>
+      </w:pPr>
+      <w:r>
+        <w:t xml:space="preserve">(j)</w:t>
+      </w:r>
+      <w:r>
+        <w:t xml:space="preserve"> </w:t>
+      </w:r>
+      <w:r>
+        <w:rPr>
+          <w:bCs/>
+          <w:b/>
+        </w:rPr>
+        <w:t xml:space="preserve">Several fines.</w:t>
+      </w:r>
+      <w:r>
+        <w:t xml:space="preserve"> </w:t>
+      </w:r>
+      <w:r>
+        <w:t xml:space="preserve">A team may draw several fines in one week.</w:t>
       </w:r>
     </w:p>
     <w:bookmarkEnd w:id="86"/>
@@ -22999,13 +23532,13 @@
         <w:t xml:space="preserve"> </w:t>
       </w:r>
       <w:r>
-        <w:t xml:space="preserve">uncontracted player opens. Highest PPV wins; the earliest offer breaks a tie. See</w:t>
-      </w:r>
-      <w:r>
-        <w:t xml:space="preserve"> </w:t>
-      </w:r>
-      <w:r>
-        <w:t xml:space="preserve">5.14.</w:t>
+        <w:t xml:space="preserve">uncontracted player opens. Highest PPV wins; the earliest offer breaks a tie. It</w:t>
+      </w:r>
+      <w:r>
+        <w:t xml:space="preserve"> </w:t>
+      </w:r>
+      <w:r>
+        <w:t xml:space="preserve">is settled when it closes. See 5.14.</w:t>
       </w:r>
     </w:p>
     <w:p>
@@ -23221,6 +23754,42 @@
           <w:bCs/>
           <w:b/>
         </w:rPr>
+        <w:t xml:space="preserve">Over-limit player</w:t>
+      </w:r>
+      <w:r>
+        <w:t xml:space="preserve"> </w:t>
+      </w:r>
+      <w:r>
+        <w:t xml:space="preserve">— After the compliance instant, a player most recently</w:t>
+      </w:r>
+      <w:r>
+        <w:t xml:space="preserve"> </w:t>
+      </w:r>
+      <w:r>
+        <w:t xml:space="preserve">added to an Active Roster that is over 25 players, three quarterbacks or three</w:t>
+      </w:r>
+      <w:r>
+        <w:t xml:space="preserve"> </w:t>
+      </w:r>
+      <w:r>
+        <w:t xml:space="preserve">kickers. He scores zero if his game kicks off while the team is still over. See</w:t>
+      </w:r>
+      <w:r>
+        <w:t xml:space="preserve"> </w:t>
+      </w:r>
+      <w:r>
+        <w:t xml:space="preserve">6.7(i).</w:t>
+      </w:r>
+    </w:p>
+    <w:p>
+      <w:pPr>
+        <w:pStyle w:val="BodyText"/>
+      </w:pPr>
+      <w:r>
+        <w:rPr>
+          <w:bCs/>
+          <w:b/>
+        </w:rPr>
         <w:t xml:space="preserve">Owner Cash</w:t>
       </w:r>
       <w:r>
@@ -23401,6 +23970,36 @@
           <w:bCs/>
           <w:b/>
         </w:rPr>
+        <w:t xml:space="preserve">Roster fine</w:t>
+      </w:r>
+      <w:r>
+        <w:t xml:space="preserve"> </w:t>
+      </w:r>
+      <w:r>
+        <w:t xml:space="preserve">— The one fine a roster out of compliance at the compliance</w:t>
+      </w:r>
+      <w:r>
+        <w:t xml:space="preserve"> </w:t>
+      </w:r>
+      <w:r>
+        <w:t xml:space="preserve">instant draws for that week: $75, or $25 if cured before the week’s first</w:t>
+      </w:r>
+      <w:r>
+        <w:t xml:space="preserve"> </w:t>
+      </w:r>
+      <w:r>
+        <w:t xml:space="preserve">game, each rising $25 from a team’s fourth of the season. See 6.7(a)–(c).</w:t>
+      </w:r>
+    </w:p>
+    <w:p>
+      <w:pPr>
+        <w:pStyle w:val="BodyText"/>
+      </w:pPr>
+      <w:r>
+        <w:rPr>
+          <w:bCs/>
+          <w:b/>
+        </w:rPr>
         <w:t xml:space="preserve">Rookie Wage Scale</w:t>
       </w:r>
       <w:r>
@@ -23560,6 +24159,36 @@
       </w:r>
       <w:r>
         <w:t xml:space="preserve">practice squad count and lifts any lock. See 5.15(n), 3.3(i)(v).</w:t>
+      </w:r>
+    </w:p>
+    <w:p>
+      <w:pPr>
+        <w:pStyle w:val="BodyText"/>
+      </w:pPr>
+      <w:r>
+        <w:rPr>
+          <w:bCs/>
+          <w:b/>
+        </w:rPr>
+        <w:t xml:space="preserve">Standing instruction (injured reserve)</w:t>
+      </w:r>
+      <w:r>
+        <w:t xml:space="preserve"> </w:t>
+      </w:r>
+      <w:r>
+        <w:t xml:space="preserve">— An owner’s election to have players</w:t>
+      </w:r>
+      <w:r>
+        <w:t xml:space="preserve"> </w:t>
+      </w:r>
+      <w:r>
+        <w:t xml:space="preserve">moved between injured reserve and the Active Roster as their injury designations</w:t>
+      </w:r>
+      <w:r>
+        <w:t xml:space="preserve"> </w:t>
+      </w:r>
+      <w:r>
+        <w:t xml:space="preserve">change. See 3.4(d).</w:t>
       </w:r>
     </w:p>
     <w:p>
@@ -23925,7 +24554,7 @@
         <w:t xml:space="preserve"> </w:t>
       </w:r>
       <w:r>
-        <w:t xml:space="preserve">mechanism behind the compliance action in 3.6(a) and (b)(i).</w:t>
+        <w:t xml:space="preserve">mechanism behind the compliance action in 3.6(a).</w:t>
       </w:r>
     </w:p>
     <w:p>
@@ -24117,13 +24746,19 @@
           <w:bCs/>
           <w:b/>
         </w:rPr>
-        <w:t xml:space="preserve">Resolution of a free agency or poach window.</w:t>
-      </w:r>
-      <w:r>
-        <w:t xml:space="preserve"> </w:t>
-      </w:r>
-      <w:r>
-        <w:t xml:space="preserve">Under 5.14(h) and 5.17(b).</w:t>
+        <w:t xml:space="preserve">Settlement of a free agency or poach window</w:t>
+      </w:r>
+      <w:r>
+        <w:t xml:space="preserve"> </w:t>
+      </w:r>
+      <w:r>
+        <w:t xml:space="preserve">that has closed and has not</w:t>
+      </w:r>
+      <w:r>
+        <w:t xml:space="preserve"> </w:t>
+      </w:r>
+      <w:r>
+        <w:t xml:space="preserve">been settled. Under 5.14(h) and 5.17(b); the window is settled as at its close.</w:t>
       </w:r>
       <w:r>
         <w:t xml:space="preserve"> </w:t>
@@ -25136,6 +25771,127 @@
       </w:r>
       <w:r>
         <w:t xml:space="preserve">Tags are not usable in the 2026 season.</w:t>
+      </w:r>
+    </w:p>
+    <w:p>
+      <w:pPr>
+        <w:pStyle w:val="BodyText"/>
+      </w:pPr>
+      <w:r>
+        <w:rPr>
+          <w:bCs/>
+          <w:b/>
+        </w:rPr>
+        <w:t xml:space="preserve">A.12 — The 2026 fine schedule</w:t>
+      </w:r>
+      <w:r>
+        <w:t xml:space="preserve"> </w:t>
+      </w:r>
+      <w:r>
+        <w:rPr>
+          <w:iCs/>
+          <w:i/>
+        </w:rPr>
+        <w:t xml:space="preserve">(body rules 3.6(b), 6.7)</w:t>
+      </w:r>
+      <w:r>
+        <w:t xml:space="preserve"> </w:t>
+      </w:r>
+      <w:r>
+        <w:t xml:space="preserve">For Weeks 1 to 4 of 2026, compliance fines were imposed under the former</w:t>
+      </w:r>
+      <w:r>
+        <w:t xml:space="preserve"> </w:t>
+      </w:r>
+      <w:r>
+        <w:t xml:space="preserve">schedule:</w:t>
+      </w:r>
+      <w:r>
+        <w:t xml:space="preserve"> </w:t>
+      </w:r>
+      <w:r>
+        <w:rPr>
+          <w:bCs/>
+          <w:b/>
+        </w:rPr>
+        <w:t xml:space="preserve">$150 per violation</w:t>
+      </w:r>
+      <w:r>
+        <w:t xml:space="preserve"> </w:t>
+      </w:r>
+      <w:r>
+        <w:t xml:space="preserve">at the compliance instant,</w:t>
+      </w:r>
+      <w:r>
+        <w:t xml:space="preserve"> </w:t>
+      </w:r>
+      <w:r>
+        <w:rPr>
+          <w:bCs/>
+          <w:b/>
+        </w:rPr>
+        <w:t xml:space="preserve">$50</w:t>
+      </w:r>
+      <w:r>
+        <w:t xml:space="preserve"> </w:t>
+      </w:r>
+      <w:r>
+        <w:t xml:space="preserve">instead</w:t>
+      </w:r>
+      <w:r>
+        <w:t xml:space="preserve"> </w:t>
+      </w:r>
+      <w:r>
+        <w:t xml:space="preserve">where the owner brought his own roster into compliance by 20:00 the same day,</w:t>
+      </w:r>
+      <w:r>
+        <w:t xml:space="preserve"> </w:t>
+      </w:r>
+      <w:r>
+        <w:t xml:space="preserve">rising by $50 from a team’s fourth violation of the season; and the</w:t>
+      </w:r>
+      <w:r>
+        <w:t xml:space="preserve"> </w:t>
+      </w:r>
+      <w:r>
+        <w:t xml:space="preserve">commissioner or co-commissioner brought a non-compliant roster into compliance</w:t>
+      </w:r>
+      <w:r>
+        <w:t xml:space="preserve"> </w:t>
+      </w:r>
+      <w:r>
+        <w:t xml:space="preserve">by 20:00 the same day under the former 3.6(b)(i). The schedule in 6.7 applies</w:t>
+      </w:r>
+      <w:r>
+        <w:t xml:space="preserve"> </w:t>
+      </w:r>
+      <w:r>
+        <w:t xml:space="preserve">from</w:t>
+      </w:r>
+      <w:r>
+        <w:t xml:space="preserve"> </w:t>
+      </w:r>
+      <w:r>
+        <w:rPr>
+          <w:bCs/>
+          <w:b/>
+        </w:rPr>
+        <w:t xml:space="preserve">Week 5, beginning 00:00 on Tuesday, October 6, 2026</w:t>
+      </w:r>
+      <w:r>
+        <w:t xml:space="preserve">. Each 2026 week in</w:t>
+      </w:r>
+      <w:r>
+        <w:t xml:space="preserve"> </w:t>
+      </w:r>
+      <w:r>
+        <w:t xml:space="preserve">which a team was fined under the former schedule counts as one roster fine</w:t>
+      </w:r>
+      <w:r>
+        <w:t xml:space="preserve"> </w:t>
+      </w:r>
+      <w:r>
+        <w:t xml:space="preserve">toward 6.7(c).</w:t>
       </w:r>
     </w:p>
     <w:bookmarkEnd w:id="117"/>
@@ -25791,6 +26547,82 @@
           </w:p>
         </w:tc>
       </w:tr>
+      <w:tr>
+        <w:tc>
+          <w:tcPr/>
+          <w:p>
+            <w:pPr>
+              <w:pStyle w:val="Compact"/>
+              <w:jc w:val="left"/>
+            </w:pPr>
+            <w:r>
+              <w:t xml:space="preserve">B.16</w:t>
+            </w:r>
+          </w:p>
+        </w:tc>
+        <w:tc>
+          <w:tcPr/>
+          <w:p>
+            <w:pPr>
+              <w:pStyle w:val="Compact"/>
+              <w:jc w:val="left"/>
+            </w:pPr>
+            <w:r>
+              <w:t xml:space="preserve">3.4, 3.6, 6.7, Schedule A.12</w:t>
+            </w:r>
+          </w:p>
+        </w:tc>
+        <w:tc>
+          <w:tcPr/>
+          <w:p>
+            <w:pPr>
+              <w:pStyle w:val="Compact"/>
+              <w:jc w:val="left"/>
+            </w:pPr>
+            <w:r>
+              <w:t xml:space="preserve">The fine schedule of October 4, 2026 is written here as the league applies it. Four points of application have not been read back by the commissioner: (i) an injured reserve place already held without a designation at the compliance instant is priced from the lapse under 6.7(h), not from the first game under 6.7(g); (ii) a violation that begins after the compliance instant, other than an overage under 6.7(i), is measured at the next compliance instant and is not fined that week; (iii) 2026 weeks fined under the former schedule count toward the fourth-fine escalation (Schedule A.12); (iv) an overage created by a standing instruction under 3.4(d)(i) follows 6.7(i), with no separate 24 hours.</w:t>
+            </w:r>
+          </w:p>
+        </w:tc>
+      </w:tr>
+      <w:tr>
+        <w:tc>
+          <w:tcPr/>
+          <w:p>
+            <w:pPr>
+              <w:pStyle w:val="Compact"/>
+              <w:jc w:val="left"/>
+            </w:pPr>
+            <w:r>
+              <w:t xml:space="preserve">B.17</w:t>
+            </w:r>
+          </w:p>
+        </w:tc>
+        <w:tc>
+          <w:tcPr/>
+          <w:p>
+            <w:pPr>
+              <w:pStyle w:val="Compact"/>
+              <w:jc w:val="left"/>
+            </w:pPr>
+            <w:r>
+              <w:t xml:space="preserve">1.10, 6.7</w:t>
+            </w:r>
+          </w:p>
+        </w:tc>
+        <w:tc>
+          <w:tcPr/>
+          <w:p>
+            <w:pPr>
+              <w:pStyle w:val="Compact"/>
+              <w:jc w:val="left"/>
+            </w:pPr>
+            <w:r>
+              <w:t xml:space="preserve">Whether a notice the league sends an owner about compliance or a poach window is a courtesy only, so that not receiving one never excuses a fine or a loss.</w:t>
+            </w:r>
+          </w:p>
+        </w:tc>
+      </w:tr>
     </w:tbl>
     <w:bookmarkEnd w:id="118"/>
     <w:bookmarkStart w:id="119" w:name="schedule-c-amendment-record"/>
@@ -25868,6 +26700,295 @@
                 <w:bCs/>
                 <w:b/>
               </w:rPr>
+              <w:t xml:space="preserve">2.2</w:t>
+            </w:r>
+          </w:p>
+        </w:tc>
+        <w:tc>
+          <w:tcPr/>
+          <w:p>
+            <w:pPr>
+              <w:pStyle w:val="Compact"/>
+              <w:jc w:val="left"/>
+            </w:pPr>
+            <w:r>
+              <w:t xml:space="preserve">Oct 5, 2026</w:t>
+            </w:r>
+          </w:p>
+        </w:tc>
+        <w:tc>
+          <w:tcPr/>
+          <w:p>
+            <w:pPr>
+              <w:pStyle w:val="Compact"/>
+              <w:jc w:val="left"/>
+            </w:pPr>
+            <w:r>
+              <w:t xml:space="preserve">Rulings of October 1 and October 4, 2026.</w:t>
+            </w:r>
+            <w:r>
+              <w:t xml:space="preserve"> </w:t>
+            </w:r>
+            <w:r>
+              <w:rPr>
+                <w:bCs/>
+                <w:b/>
+              </w:rPr>
+              <w:t xml:space="preserve">6.7</w:t>
+            </w:r>
+            <w:r>
+              <w:t xml:space="preserve"> </w:t>
+            </w:r>
+            <w:r>
+              <w:t xml:space="preserve">rewritten for the fine schedule that applies from Week 5: one</w:t>
+            </w:r>
+            <w:r>
+              <w:t xml:space="preserve"> </w:t>
+            </w:r>
+            <w:r>
+              <w:rPr>
+                <w:bCs/>
+                <w:b/>
+              </w:rPr>
+              <w:t xml:space="preserve">roster fine</w:t>
+            </w:r>
+            <w:r>
+              <w:t xml:space="preserve"> </w:t>
+            </w:r>
+            <w:r>
+              <w:t xml:space="preserve">a week ($75, or $25 if the roster is compliant before the week’s first game), rising $25 from the fourth of a season;</w:t>
+            </w:r>
+            <w:r>
+              <w:t xml:space="preserve"> </w:t>
+            </w:r>
+            <w:r>
+              <w:rPr>
+                <w:bCs/>
+                <w:b/>
+              </w:rPr>
+              <w:t xml:space="preserve">$25 per unit</w:t>
+            </w:r>
+            <w:r>
+              <w:t xml:space="preserve"> </w:t>
+            </w:r>
+            <w:r>
+              <w:t xml:space="preserve">still open 24 hours after the first game;</w:t>
+            </w:r>
+            <w:r>
+              <w:t xml:space="preserve"> </w:t>
+            </w:r>
+            <w:r>
+              <w:rPr>
+                <w:bCs/>
+                <w:b/>
+              </w:rPr>
+              <w:t xml:space="preserve">$25</w:t>
+            </w:r>
+            <w:r>
+              <w:t xml:space="preserve"> </w:t>
+            </w:r>
+            <w:r>
+              <w:t xml:space="preserve">for an injured reserve place held 24 hours without a qualifying designation; over 25 Active, three quarterbacks or three kickers after the compliance instant, the</w:t>
+            </w:r>
+            <w:r>
+              <w:t xml:space="preserve"> </w:t>
+            </w:r>
+            <w:r>
+              <w:rPr>
+                <w:bCs/>
+                <w:b/>
+              </w:rPr>
+              <w:t xml:space="preserve">most recently added</w:t>
+            </w:r>
+            <w:r>
+              <w:t xml:space="preserve"> </w:t>
+            </w:r>
+            <w:r>
+              <w:t xml:space="preserve">player over the limit</w:t>
+            </w:r>
+            <w:r>
+              <w:t xml:space="preserve"> </w:t>
+            </w:r>
+            <w:r>
+              <w:rPr>
+                <w:bCs/>
+                <w:b/>
+              </w:rPr>
+              <w:t xml:space="preserve">scores zero</w:t>
+            </w:r>
+            <w:r>
+              <w:t xml:space="preserve"> </w:t>
+            </w:r>
+            <w:r>
+              <w:t xml:space="preserve">if his game kicks off while the team is over, and draws $25 where the overage is new; several fines in one week. Letters (d)–(f) keep their subjects; (g)–(j) are new.</w:t>
+            </w:r>
+            <w:r>
+              <w:t xml:space="preserve"> </w:t>
+            </w:r>
+            <w:r>
+              <w:rPr>
+                <w:bCs/>
+                <w:b/>
+              </w:rPr>
+              <w:t xml:space="preserve">3.6(b)(i) repealed</w:t>
+            </w:r>
+            <w:r>
+              <w:t xml:space="preserve">: an officer no longer brings a non-compliant roster into compliance.</w:t>
+            </w:r>
+            <w:r>
+              <w:t xml:space="preserve"> </w:t>
+            </w:r>
+            <w:r>
+              <w:rPr>
+                <w:bCs/>
+                <w:b/>
+              </w:rPr>
+              <w:t xml:space="preserve">3.6(b)(ii)</w:t>
+            </w:r>
+            <w:r>
+              <w:t xml:space="preserve"> </w:t>
+            </w:r>
+            <w:r>
+              <w:t xml:space="preserve">re-pointed to the new schedule.</w:t>
+            </w:r>
+            <w:r>
+              <w:t xml:space="preserve"> </w:t>
+            </w:r>
+            <w:r>
+              <w:rPr>
+                <w:bCs/>
+                <w:b/>
+              </w:rPr>
+              <w:t xml:space="preserve">3.4(b)(i)</w:t>
+            </w:r>
+            <w:r>
+              <w:t xml:space="preserve"> </w:t>
+            </w:r>
+            <w:r>
+              <w:t xml:space="preserve">gains the 24-hour fine.</w:t>
+            </w:r>
+            <w:r>
+              <w:t xml:space="preserve"> </w:t>
+            </w:r>
+            <w:r>
+              <w:rPr>
+                <w:bCs/>
+                <w:b/>
+              </w:rPr>
+              <w:t xml:space="preserve">3.4(d)</w:t>
+            </w:r>
+            <w:r>
+              <w:t xml:space="preserve"> </w:t>
+            </w:r>
+            <w:r>
+              <w:t xml:space="preserve">new: the two standing instructions for injured reserve.</w:t>
+            </w:r>
+            <w:r>
+              <w:t xml:space="preserve"> </w:t>
+            </w:r>
+            <w:r>
+              <w:rPr>
+                <w:bCs/>
+                <w:b/>
+              </w:rPr>
+              <w:t xml:space="preserve">5.14(h)</w:t>
+            </w:r>
+            <w:r>
+              <w:t xml:space="preserve"> </w:t>
+            </w:r>
+            <w:r>
+              <w:t xml:space="preserve">and</w:t>
+            </w:r>
+            <w:r>
+              <w:t xml:space="preserve"> </w:t>
+            </w:r>
+            <w:r>
+              <w:rPr>
+                <w:bCs/>
+                <w:b/>
+              </w:rPr>
+              <w:t xml:space="preserve">5.17(b)</w:t>
+            </w:r>
+            <w:r>
+              <w:t xml:space="preserve">: a free agency or poach window is settled when it closes, and the signing week is the week it closed, however late settlement is completed;</w:t>
+            </w:r>
+            <w:r>
+              <w:t xml:space="preserve"> </w:t>
+            </w:r>
+            <w:r>
+              <w:rPr>
+                <w:bCs/>
+                <w:b/>
+              </w:rPr>
+              <w:t xml:space="preserve">Appendix A.1(i)</w:t>
+            </w:r>
+            <w:r>
+              <w:t xml:space="preserve"> </w:t>
+            </w:r>
+            <w:r>
+              <w:t xml:space="preserve">follows.</w:t>
+            </w:r>
+            <w:r>
+              <w:t xml:space="preserve"> </w:t>
+            </w:r>
+            <w:r>
+              <w:rPr>
+                <w:bCs/>
+                <w:b/>
+              </w:rPr>
+              <w:t xml:space="preserve">1.10(c)</w:t>
+            </w:r>
+            <w:r>
+              <w:t xml:space="preserve">: the league office wire explains when and why a fine was incurred and carries an elected compliance notice; the rumour wire announces every poach window without naming the opener.</w:t>
+            </w:r>
+            <w:r>
+              <w:t xml:space="preserve"> </w:t>
+            </w:r>
+            <w:r>
+              <w:rPr>
+                <w:bCs/>
+                <w:b/>
+              </w:rPr>
+              <w:t xml:space="preserve">Schedule A.12</w:t>
+            </w:r>
+            <w:r>
+              <w:t xml:space="preserve"> </w:t>
+            </w:r>
+            <w:r>
+              <w:t xml:space="preserve">records the Weeks 1–4 schedule;</w:t>
+            </w:r>
+            <w:r>
+              <w:t xml:space="preserve"> </w:t>
+            </w:r>
+            <w:r>
+              <w:rPr>
+                <w:bCs/>
+                <w:b/>
+              </w:rPr>
+              <w:t xml:space="preserve">Schedule B.16–B.17</w:t>
+            </w:r>
+            <w:r>
+              <w:t xml:space="preserve"> </w:t>
+            </w:r>
+            <w:r>
+              <w:t xml:space="preserve">added. Definitions added for the roster fine, the over-limit player and the standing instruction.</w:t>
+            </w:r>
+          </w:p>
+        </w:tc>
+      </w:tr>
+      <w:tr>
+        <w:tc>
+          <w:tcPr/>
+          <w:p>
+            <w:pPr>
+              <w:pStyle w:val="Compact"/>
+              <w:jc w:val="left"/>
+            </w:pPr>
+            <w:r>
+              <w:rPr>
+                <w:bCs/>
+                <w:b/>
+              </w:rPr>
               <w:t xml:space="preserve">2.1</w:t>
             </w:r>
           </w:p>
@@ -26247,7 +27368,7 @@
           <w:iCs/>
           <w:i/>
         </w:rPr>
-        <w:t xml:space="preserve">End of the EDFL Rule Book, Version 2.1.</w:t>
+        <w:t xml:space="preserve">End of the EDFL Rule Book, Version 2.2.</w:t>
       </w:r>
     </w:p>
     <w:bookmarkEnd w:id="119"/>
@@ -26337,7 +27458,7 @@
         <w:sz w:val="16"/>
         <w:szCs w:val="16"/>
       </w:rPr>
-      <w:t xml:space="preserve">EDFL Rule Book v2.1 — the governing document</w:t>
+      <w:t xml:space="preserve">EDFL Rule Book v2.2 — the governing document</w:t>
     </w:r>
   </w:p>
 </w:hdr>

</xml_diff>